<commit_message>
feat: remove waitlist-related logic and update documentation
</commit_message>
<xml_diff>
--- a/docs/for-philip-2026-08-21/Groundwork - Automated Email Audit.docx
+++ b/docs/for-philip-2026-08-21/Groundwork - Automated Email Audit.docx
@@ -55,7 +55,7 @@
       </w:r>
       <w:r>
         <w:rPr/>
-        <w:t>, plus three more that were built and are now unreachable. Six of the eight whose wording is ours to review were silently failing when this audit began; all six have since been fixed.</w:t>
+        <w:t>, plus three more that were built and are now unreachable. Six of the seven whose wording is ours to review were silently failing when this audit began; all six have since been fixed.</w:t>
       </w:r>
     </w:p>
     <w:p>
@@ -67,7 +67,7 @@
       </w:pPr>
       <w:r>
         <w:rPr/>
-        <w:t>Eight have templates in our codebase and are reproduced in full below, in both languages, exactly as sent. The other four are Supabase's own and must be reviewed in the Supabase dashboard; they are listed at the end with the place to find each one.</w:t>
+        <w:t>Seven have templates in our codebase and are reproduced in full below, in both languages, exactly as sent. The other four are Supabase's own and must be reviewed in the Supabase dashboard; they are listed at the end with the place to find each one.</w:t>
       </w:r>
     </w:p>
     <w:p>
@@ -90,7 +90,7 @@
       </w:pPr>
       <w:r>
         <w:rPr/>
-        <w:t>Six of these eight were reaching nobody. All six are fixed.</w:t>
+        <w:t>Six of these seven were reaching nobody. All six are fixed.</w:t>
       </w:r>
     </w:p>
     <w:p>
@@ -102,7 +102,7 @@
       </w:pPr>
       <w:r>
         <w:rPr/>
-        <w:t>The audit that produced this document found six of the eight emails below were silently failing. Two unrelated faults, neither of which showed an error to a customer or wrote anything to a log a person would read — which is why they ran for months unnoticed. Both are now fixed and deployed.</w:t>
+        <w:t>The audit that produced this document found six of the seven emails below were silently failing. Two unrelated faults, neither of which showed an error to a customer or wrote anything to a log a person would read — which is why they ran for months unnoticed. Both are now fixed and deployed.</w:t>
       </w:r>
     </w:p>
     <w:p>
@@ -157,6 +157,24 @@
       <w:r>
         <w:rPr/>
         <w:t xml:space="preserve"> was closed at the same time. The invite endpoint accepted any recipient and any wording from an anonymous request and sent it from our domain. It now reads both from the invite record instead.</w:t>
+      </w:r>
+    </w:p>
+    <w:p>
+      <w:pPr>
+        <w:pStyle w:val="BodyText"/>
+        <w:bidi w:val="0"/>
+        <w:jc w:val="left"/>
+        <w:rPr/>
+      </w:pPr>
+      <w:r>
+        <w:rPr>
+          <w:b/>
+        </w:rPr>
+        <w:t>Three dead templates were deleted</w:t>
+      </w:r>
+      <w:r>
+        <w:rPr/>
+        <w:t xml:space="preserve"> — a complete waitlist signup flow, its team alert and its CRM push, all still deployed and publicly reachable months after the page that called them was removed. The stored waitlist entries and the admin screen that reads them are untouched.</w:t>
       </w:r>
     </w:p>
     <w:p>
@@ -294,7 +312,7 @@
                 <w:b/>
                 <w:sz w:val="36"/>
               </w:rPr>
-              <w:t>1</w:t>
+              <w:t>3</w:t>
             </w:r>
             <w:r>
               <w:rPr/>
@@ -305,7 +323,7 @@
                 <w:color w:val="5A5A57"/>
                 <w:sz w:val="19"/>
               </w:rPr>
-              <w:t>Dead code</w:t>
+              <w:t>Deleted</w:t>
             </w:r>
           </w:p>
         </w:tc>
@@ -3188,390 +3206,6 @@
                   </pic:nvPicPr>
                   <pic:blipFill>
                     <a:blip r:embed="rId20"/>
-                    <a:stretch>
-                      <a:fillRect/>
-                    </a:stretch>
-                  </pic:blipFill>
-                  <pic:spPr bwMode="auto">
-                    <a:xfrm>
-                      <a:off x="0" y="0"/>
-                      <a:ext cx="4095750" cy="2886075"/>
-                    </a:xfrm>
-                    <a:prstGeom prst="rect">
-                      <a:avLst/>
-                    </a:prstGeom>
-                  </pic:spPr>
-                </pic:pic>
-              </a:graphicData>
-            </a:graphic>
-          </wp:inline>
-        </w:drawing>
-      </w:r>
-      <w:r>
-        <w:br w:type="page"/>
-      </w:r>
-    </w:p>
-    <w:p>
-      <w:pPr>
-        <w:pStyle w:val="Heading2"/>
-        <w:bidi w:val="0"/>
-        <w:ind w:hanging="0" w:left="0" w:right="0"/>
-        <w:jc w:val="left"/>
-        <w:rPr/>
-      </w:pPr>
-      <w:r>
-        <w:rPr/>
-        <w:t>Sent to nobody</w:t>
-      </w:r>
-    </w:p>
-    <w:p>
-      <w:pPr>
-        <w:pStyle w:val="BodyTextsmall"/>
-        <w:bidi w:val="0"/>
-        <w:jc w:val="left"/>
-        <w:rPr/>
-      </w:pPr>
-      <w:r>
-        <w:rPr/>
-        <w:t>Built, deployed, and unreachable.  ·  1 email</w:t>
-      </w:r>
-    </w:p>
-    <w:p>
-      <w:pPr>
-        <w:pStyle w:val="HorizontalLine"/>
-        <w:bidi w:val="0"/>
-        <w:jc w:val="left"/>
-        <w:rPr/>
-      </w:pPr>
-      <w:r>
-        <w:rPr/>
-      </w:r>
-    </w:p>
-    <w:p>
-      <w:pPr>
-        <w:pStyle w:val="Heading3"/>
-        <w:bidi w:val="0"/>
-        <w:jc w:val="left"/>
-        <w:rPr/>
-      </w:pPr>
-      <w:r>
-        <w:rPr/>
-        <w:t>Waitlist welcome — DEAD CODE</w:t>
-      </w:r>
-    </w:p>
-    <w:tbl>
-      <w:tblPr>
-        <w:tblW w:w="5000" w:type="pct"/>
-        <w:jc w:val="left"/>
-        <w:tblInd w:w="0" w:type="dxa"/>
-        <w:tblLayout w:type="fixed"/>
-        <w:tblCellMar>
-          <w:top w:w="28" w:type="dxa"/>
-          <w:left w:w="28" w:type="dxa"/>
-          <w:bottom w:w="28" w:type="dxa"/>
-          <w:right w:w="28" w:type="dxa"/>
-        </w:tblCellMar>
-      </w:tblPr>
-      <w:tblGrid>
-        <w:gridCol w:w="1484"/>
-        <w:gridCol w:w="8382"/>
-      </w:tblGrid>
-      <w:tr>
-        <w:trPr/>
-        <w:tc>
-          <w:tcPr>
-            <w:tcW w:w="1484" w:type="dxa"/>
-            <w:tcBorders/>
-            <w:vAlign w:val="center"/>
-          </w:tcPr>
-          <w:p>
-            <w:pPr>
-              <w:pStyle w:val="TableContents"/>
-              <w:bidi w:val="0"/>
-              <w:jc w:val="left"/>
-              <w:rPr>
-                <w:b/>
-              </w:rPr>
-            </w:pPr>
-            <w:r>
-              <w:rPr>
-                <w:b/>
-              </w:rPr>
-              <w:t>When</w:t>
-            </w:r>
-          </w:p>
-        </w:tc>
-        <w:tc>
-          <w:tcPr>
-            <w:tcW w:w="8382" w:type="dxa"/>
-            <w:tcBorders/>
-            <w:vAlign w:val="center"/>
-          </w:tcPr>
-          <w:p>
-            <w:pPr>
-              <w:pStyle w:val="TableContents"/>
-              <w:widowControl w:val="false"/>
-              <w:suppressLineNumbers/>
-              <w:bidi w:val="0"/>
-              <w:jc w:val="left"/>
-              <w:rPr/>
-            </w:pPr>
-            <w:r>
-              <w:rPr/>
-              <w:t>Nothing triggers it. The page that called it was deleted with the rest of the community feature.</w:t>
-            </w:r>
-          </w:p>
-        </w:tc>
-      </w:tr>
-      <w:tr>
-        <w:trPr/>
-        <w:tc>
-          <w:tcPr>
-            <w:tcW w:w="1484" w:type="dxa"/>
-            <w:tcBorders/>
-            <w:vAlign w:val="center"/>
-          </w:tcPr>
-          <w:p>
-            <w:pPr>
-              <w:pStyle w:val="TableContents"/>
-              <w:bidi w:val="0"/>
-              <w:jc w:val="left"/>
-              <w:rPr>
-                <w:b/>
-              </w:rPr>
-            </w:pPr>
-            <w:r>
-              <w:rPr>
-                <w:b/>
-              </w:rPr>
-              <w:t>Goes to</w:t>
-            </w:r>
-          </w:p>
-        </w:tc>
-        <w:tc>
-          <w:tcPr>
-            <w:tcW w:w="8382" w:type="dxa"/>
-            <w:tcBorders/>
-            <w:vAlign w:val="center"/>
-          </w:tcPr>
-          <w:p>
-            <w:pPr>
-              <w:pStyle w:val="TableContents"/>
-              <w:widowControl w:val="false"/>
-              <w:suppressLineNumbers/>
-              <w:bidi w:val="0"/>
-              <w:jc w:val="left"/>
-              <w:rPr/>
-            </w:pPr>
-            <w:r>
-              <w:rPr/>
-              <w:t>Nobody</w:t>
-            </w:r>
-          </w:p>
-        </w:tc>
-      </w:tr>
-      <w:tr>
-        <w:trPr/>
-        <w:tc>
-          <w:tcPr>
-            <w:tcW w:w="1484" w:type="dxa"/>
-            <w:tcBorders/>
-            <w:vAlign w:val="center"/>
-          </w:tcPr>
-          <w:p>
-            <w:pPr>
-              <w:pStyle w:val="TableContents"/>
-              <w:bidi w:val="0"/>
-              <w:jc w:val="left"/>
-              <w:rPr>
-                <w:b/>
-              </w:rPr>
-            </w:pPr>
-            <w:r>
-              <w:rPr>
-                <w:b/>
-              </w:rPr>
-              <w:t>Status</w:t>
-            </w:r>
-          </w:p>
-        </w:tc>
-        <w:tc>
-          <w:tcPr>
-            <w:tcW w:w="8382" w:type="dxa"/>
-            <w:tcBorders/>
-            <w:vAlign w:val="center"/>
-          </w:tcPr>
-          <w:p>
-            <w:pPr>
-              <w:pStyle w:val="TableContents"/>
-              <w:widowControl w:val="false"/>
-              <w:suppressLineNumbers/>
-              <w:bidi w:val="0"/>
-              <w:jc w:val="left"/>
-              <w:rPr/>
-            </w:pPr>
-            <w:r>
-              <w:rPr/>
-              <w:t>Fully built and still deployed, so it can be reached by anyone who knows the address. Recommend deleting it.</w:t>
-            </w:r>
-          </w:p>
-        </w:tc>
-      </w:tr>
-      <w:tr>
-        <w:trPr/>
-        <w:tc>
-          <w:tcPr>
-            <w:tcW w:w="1484" w:type="dxa"/>
-            <w:tcBorders/>
-            <w:vAlign w:val="center"/>
-          </w:tcPr>
-          <w:p>
-            <w:pPr>
-              <w:pStyle w:val="TableContents"/>
-              <w:bidi w:val="0"/>
-              <w:jc w:val="left"/>
-              <w:rPr>
-                <w:b/>
-              </w:rPr>
-            </w:pPr>
-            <w:r>
-              <w:rPr>
-                <w:b/>
-              </w:rPr>
-              <w:t>In the code</w:t>
-            </w:r>
-          </w:p>
-        </w:tc>
-        <w:tc>
-          <w:tcPr>
-            <w:tcW w:w="8382" w:type="dxa"/>
-            <w:tcBorders/>
-            <w:vAlign w:val="center"/>
-          </w:tcPr>
-          <w:p>
-            <w:pPr>
-              <w:pStyle w:val="TableContents"/>
-              <w:bidi w:val="0"/>
-              <w:ind w:hanging="0" w:left="0" w:right="0"/>
-              <w:jc w:val="left"/>
-              <w:rPr>
-                <w:rFonts w:ascii="Consolas;monospace" w:hAnsi="Consolas;monospace"/>
-              </w:rPr>
-            </w:pPr>
-            <w:r>
-              <w:rPr>
-                <w:rFonts w:ascii="Consolas;monospace" w:hAnsi="Consolas;monospace"/>
-              </w:rPr>
-              <w:t>api/waitlist-welcome.ts</w:t>
-            </w:r>
-          </w:p>
-        </w:tc>
-      </w:tr>
-    </w:tbl>
-    <w:p>
-      <w:pPr>
-        <w:pStyle w:val="Heading4"/>
-        <w:bidi w:val="0"/>
-        <w:jc w:val="left"/>
-        <w:rPr/>
-      </w:pPr>
-      <w:r>
-        <w:rPr/>
-        <w:t>English  —  You're on the Groundwork waitlist</w:t>
-      </w:r>
-    </w:p>
-    <w:p>
-      <w:pPr>
-        <w:pStyle w:val="BodyText"/>
-        <w:keepLines/>
-        <w:bidi w:val="0"/>
-        <w:ind w:hanging="0" w:left="0" w:right="0"/>
-        <w:jc w:val="left"/>
-        <w:rPr/>
-      </w:pPr>
-      <w:r>
-        <w:rPr/>
-        <w:drawing>
-          <wp:inline distT="0" distB="0" distL="0" distR="0">
-            <wp:extent cx="4095750" cy="2733675"/>
-            <wp:effectExtent l="0" t="0" r="0" b="0"/>
-            <wp:docPr id="20" name="Image20" descr=""/>
-            <wp:cNvGraphicFramePr>
-              <a:graphicFrameLocks xmlns:a="http://schemas.openxmlformats.org/drawingml/2006/main" noChangeAspect="1"/>
-            </wp:cNvGraphicFramePr>
-            <a:graphic xmlns:a="http://schemas.openxmlformats.org/drawingml/2006/main">
-              <a:graphicData uri="http://schemas.openxmlformats.org/drawingml/2006/picture">
-                <pic:pic xmlns:pic="http://schemas.openxmlformats.org/drawingml/2006/picture">
-                  <pic:nvPicPr>
-                    <pic:cNvPr id="20" name="Image20" descr=""/>
-                    <pic:cNvPicPr>
-                      <a:picLocks noChangeAspect="1" noChangeArrowheads="1"/>
-                    </pic:cNvPicPr>
-                  </pic:nvPicPr>
-                  <pic:blipFill>
-                    <a:blip r:embed="rId21"/>
-                    <a:stretch>
-                      <a:fillRect/>
-                    </a:stretch>
-                  </pic:blipFill>
-                  <pic:spPr bwMode="auto">
-                    <a:xfrm>
-                      <a:off x="0" y="0"/>
-                      <a:ext cx="4095750" cy="2733675"/>
-                    </a:xfrm>
-                    <a:prstGeom prst="rect">
-                      <a:avLst/>
-                    </a:prstGeom>
-                  </pic:spPr>
-                </pic:pic>
-              </a:graphicData>
-            </a:graphic>
-          </wp:inline>
-        </w:drawing>
-      </w:r>
-    </w:p>
-    <w:p>
-      <w:pPr>
-        <w:pStyle w:val="Heading4"/>
-        <w:bidi w:val="0"/>
-        <w:jc w:val="left"/>
-        <w:rPr/>
-      </w:pPr>
-      <w:r>
-        <w:rPr/>
-        <w:t>Français  —  Vous êtes sur la liste d'attente Groundwork</w:t>
-      </w:r>
-    </w:p>
-    <w:p>
-      <w:pPr>
-        <w:pStyle w:val="BodyText"/>
-        <w:keepLines/>
-        <w:bidi w:val="0"/>
-        <w:ind w:hanging="0" w:left="0" w:right="0"/>
-        <w:jc w:val="left"/>
-        <w:rPr/>
-      </w:pPr>
-      <w:r>
-        <w:rPr/>
-        <w:drawing>
-          <wp:inline distT="0" distB="0" distL="0" distR="0">
-            <wp:extent cx="4095750" cy="2886075"/>
-            <wp:effectExtent l="0" t="0" r="0" b="0"/>
-            <wp:docPr id="21" name="Image21" descr=""/>
-            <wp:cNvGraphicFramePr>
-              <a:graphicFrameLocks xmlns:a="http://schemas.openxmlformats.org/drawingml/2006/main" noChangeAspect="1"/>
-            </wp:cNvGraphicFramePr>
-            <a:graphic xmlns:a="http://schemas.openxmlformats.org/drawingml/2006/main">
-              <a:graphicData uri="http://schemas.openxmlformats.org/drawingml/2006/picture">
-                <pic:pic xmlns:pic="http://schemas.openxmlformats.org/drawingml/2006/picture">
-                  <pic:nvPicPr>
-                    <pic:cNvPr id="21" name="Image21" descr=""/>
-                    <pic:cNvPicPr>
-                      <a:picLocks noChangeAspect="1" noChangeArrowheads="1"/>
-                    </pic:cNvPicPr>
-                  </pic:nvPicPr>
-                  <pic:blipFill>
-                    <a:blip r:embed="rId22"/>
                     <a:stretch>
                       <a:fillRect/>
                     </a:stretch>

</xml_diff>

<commit_message>
feat(env): add TEAM_INBOX variable for contractor application alerts
</commit_message>
<xml_diff>
--- a/docs/for-philip-2026-08-21/Groundwork - Automated Email Audit.docx
+++ b/docs/for-philip-2026-08-21/Groundwork - Automated Email Audit.docx
@@ -11,7 +11,7 @@
       </w:pPr>
       <w:r>
         <w:rPr/>
-        <w:t>GROUNDWORK BY JALLA  ·  21 AUGUST 2026</w:t>
+        <w:t>GROUNDWORK BY JALLA  ·  23 AUGUST 2026</w:t>
       </w:r>
     </w:p>
     <w:p>
@@ -55,7 +55,7 @@
       </w:r>
       <w:r>
         <w:rPr/>
-        <w:t>, plus three more that were built and are now unreachable. Six of the seven whose wording is ours to review were silently failing when this audit began; all six have since been fixed.</w:t>
+        <w:t>, plus three more that were built and are now unreachable. Six of the seven we send ourselves were silently failing when this audit began; all six have since been fixed.</w:t>
       </w:r>
     </w:p>
     <w:p>
@@ -67,7 +67,7 @@
       </w:pPr>
       <w:r>
         <w:rPr/>
-        <w:t>Seven have templates in our codebase and are reproduced in full below, in both languages, exactly as sent. The other four are Supabase's own and must be reviewed in the Supabase dashboard; they are listed at the end with the place to find each one.</w:t>
+        <w:t>Eight are reproduced in full below — seven of ours in both languages, exactly as sent, plus the password reset, which Supabase sends but we now write. The remaining four are Supabase's own and must be reviewed in its dashboard; they are listed at the end with the place to find each one.</w:t>
       </w:r>
     </w:p>
     <w:p>
@@ -90,7 +90,7 @@
       </w:pPr>
       <w:r>
         <w:rPr/>
-        <w:t>Six of these seven were reaching nobody. All six are fixed.</w:t>
+        <w:t>Six were reaching nobody. All six are fixed — and one gap is left.</w:t>
       </w:r>
     </w:p>
     <w:p>
@@ -175,6 +175,24 @@
       <w:r>
         <w:rPr/>
         <w:t xml:space="preserve"> — a complete waitlist signup flow, its team alert and its CRM push, all still deployed and publicly reachable months after the page that called them was removed. The stored waitlist entries and the admin screen that reads them are untouched.</w:t>
+      </w:r>
+    </w:p>
+    <w:p>
+      <w:pPr>
+        <w:pStyle w:val="BodyText"/>
+        <w:bidi w:val="0"/>
+        <w:jc w:val="left"/>
+        <w:rPr/>
+      </w:pPr>
+      <w:r>
+        <w:rPr>
+          <w:b/>
+        </w:rPr>
+        <w:t>The four emails at the end of this document are English only</w:t>
+      </w:r>
+      <w:r>
+        <w:rPr/>
+        <w:t xml:space="preserve"> — and that is the one thing still outstanding. Everything we send ourselves is written in both languages and picks the one the recipient chose. The four that Supabase sends cannot: it holds a single template per email type with no notion of who is receiving it. So a French applicant confirms their email in English, and resets their password in English, on a product that is otherwise bilingual throughout. Fixable — Supabase can hand sending back to us, which would put all twelve on the same footing — but it is a piece of work, not a setting.</w:t>
       </w:r>
     </w:p>
     <w:p>
@@ -234,7 +252,7 @@
                 <w:b/>
                 <w:sz w:val="36"/>
               </w:rPr>
-              <w:t>7</w:t>
+              <w:t>8</w:t>
             </w:r>
             <w:r>
               <w:rPr/>
@@ -351,7 +369,7 @@
                 <w:b/>
                 <w:sz w:val="36"/>
               </w:rPr>
-              <w:t>5</w:t>
+              <w:t>4</w:t>
             </w:r>
             <w:r>
               <w:rPr/>
@@ -433,14 +451,14 @@
         </w:tblCellMar>
       </w:tblPr>
       <w:tblGrid>
-        <w:gridCol w:w="1334"/>
-        <w:gridCol w:w="8532"/>
+        <w:gridCol w:w="997"/>
+        <w:gridCol w:w="8869"/>
       </w:tblGrid>
       <w:tr>
         <w:trPr/>
         <w:tc>
           <w:tcPr>
-            <w:tcW w:w="1334" w:type="dxa"/>
+            <w:tcW w:w="997" w:type="dxa"/>
             <w:tcBorders/>
             <w:vAlign w:val="center"/>
           </w:tcPr>
@@ -463,7 +481,7 @@
         </w:tc>
         <w:tc>
           <w:tcPr>
-            <w:tcW w:w="8532" w:type="dxa"/>
+            <w:tcW w:w="8869" w:type="dxa"/>
             <w:tcBorders/>
             <w:vAlign w:val="center"/>
           </w:tcPr>
@@ -487,7 +505,7 @@
         <w:trPr/>
         <w:tc>
           <w:tcPr>
-            <w:tcW w:w="1334" w:type="dxa"/>
+            <w:tcW w:w="997" w:type="dxa"/>
             <w:tcBorders/>
             <w:vAlign w:val="center"/>
           </w:tcPr>
@@ -510,7 +528,7 @@
         </w:tc>
         <w:tc>
           <w:tcPr>
-            <w:tcW w:w="8532" w:type="dxa"/>
+            <w:tcW w:w="8869" w:type="dxa"/>
             <w:tcBorders/>
             <w:vAlign w:val="center"/>
           </w:tcPr>
@@ -534,7 +552,7 @@
         <w:trPr/>
         <w:tc>
           <w:tcPr>
-            <w:tcW w:w="1334" w:type="dxa"/>
+            <w:tcW w:w="997" w:type="dxa"/>
             <w:tcBorders/>
             <w:vAlign w:val="center"/>
           </w:tcPr>
@@ -557,7 +575,7 @@
         </w:tc>
         <w:tc>
           <w:tcPr>
-            <w:tcW w:w="8532" w:type="dxa"/>
+            <w:tcW w:w="8869" w:type="dxa"/>
             <w:tcBorders/>
             <w:vAlign w:val="center"/>
           </w:tcPr>
@@ -572,7 +590,7 @@
             </w:pPr>
             <w:r>
               <w:rPr/>
-              <w:t>Was never arriving. The handler crashed before it could send, and the applicant still saw “submitted”. Fixed and deployed.</w:t>
+              <w:t>Was never arriving — the handler crashed before it could send, and the applicant still saw “submitted”. Fixed. The system now records who was actually emailed, so a send that fails shows up as a count on the applications screen, with a button to send it by hand.</w:t>
             </w:r>
           </w:p>
         </w:tc>
@@ -581,7 +599,7 @@
         <w:trPr/>
         <w:tc>
           <w:tcPr>
-            <w:tcW w:w="1334" w:type="dxa"/>
+            <w:tcW w:w="997" w:type="dxa"/>
             <w:tcBorders/>
             <w:vAlign w:val="center"/>
           </w:tcPr>
@@ -604,7 +622,7 @@
         </w:tc>
         <w:tc>
           <w:tcPr>
-            <w:tcW w:w="8532" w:type="dxa"/>
+            <w:tcW w:w="8869" w:type="dxa"/>
             <w:tcBorders/>
             <w:vAlign w:val="center"/>
           </w:tcPr>
@@ -1103,7 +1121,7 @@
         <w:rPr/>
         <w:drawing>
           <wp:inline distT="0" distB="0" distL="0" distR="0">
-            <wp:extent cx="4095750" cy="3448050"/>
+            <wp:extent cx="4095750" cy="3590925"/>
             <wp:effectExtent l="0" t="0" r="0" b="0"/>
             <wp:docPr id="8" name="Image8" descr=""/>
             <wp:cNvGraphicFramePr>
@@ -1127,7 +1145,7 @@
                   <pic:spPr bwMode="auto">
                     <a:xfrm>
                       <a:off x="0" y="0"/>
-                      <a:ext cx="4095750" cy="3448050"/>
+                      <a:ext cx="4095750" cy="3590925"/>
                     </a:xfrm>
                     <a:prstGeom prst="rect">
                       <a:avLst/>
@@ -3239,6 +3257,328 @@
       </w:pPr>
       <w:r>
         <w:rPr/>
+        <w:t>Account and access</w:t>
+      </w:r>
+    </w:p>
+    <w:p>
+      <w:pPr>
+        <w:pStyle w:val="BodyTextsmall"/>
+        <w:bidi w:val="0"/>
+        <w:jc w:val="left"/>
+        <w:rPr/>
+      </w:pPr>
+      <w:r>
+        <w:rPr/>
+        <w:t>Sent by Supabase, written by us — so this one we can show you.  ·  1 email</w:t>
+      </w:r>
+    </w:p>
+    <w:p>
+      <w:pPr>
+        <w:pStyle w:val="HorizontalLine"/>
+        <w:bidi w:val="0"/>
+        <w:jc w:val="left"/>
+        <w:rPr/>
+      </w:pPr>
+      <w:r>
+        <w:rPr/>
+      </w:r>
+    </w:p>
+    <w:p>
+      <w:pPr>
+        <w:pStyle w:val="Heading3"/>
+        <w:bidi w:val="0"/>
+        <w:jc w:val="left"/>
+        <w:rPr/>
+      </w:pPr>
+      <w:r>
+        <w:rPr/>
+        <w:t>Reset your password — REDESIGNED</w:t>
+      </w:r>
+    </w:p>
+    <w:tbl>
+      <w:tblPr>
+        <w:tblW w:w="5000" w:type="pct"/>
+        <w:jc w:val="left"/>
+        <w:tblInd w:w="0" w:type="dxa"/>
+        <w:tblLayout w:type="fixed"/>
+        <w:tblCellMar>
+          <w:top w:w="28" w:type="dxa"/>
+          <w:left w:w="28" w:type="dxa"/>
+          <w:bottom w:w="28" w:type="dxa"/>
+          <w:right w:w="28" w:type="dxa"/>
+        </w:tblCellMar>
+      </w:tblPr>
+      <w:tblGrid>
+        <w:gridCol w:w="1005"/>
+        <w:gridCol w:w="8861"/>
+      </w:tblGrid>
+      <w:tr>
+        <w:trPr/>
+        <w:tc>
+          <w:tcPr>
+            <w:tcW w:w="1005" w:type="dxa"/>
+            <w:tcBorders/>
+            <w:vAlign w:val="center"/>
+          </w:tcPr>
+          <w:p>
+            <w:pPr>
+              <w:pStyle w:val="TableContents"/>
+              <w:bidi w:val="0"/>
+              <w:jc w:val="left"/>
+              <w:rPr>
+                <w:b/>
+              </w:rPr>
+            </w:pPr>
+            <w:r>
+              <w:rPr>
+                <w:b/>
+              </w:rPr>
+              <w:t>When</w:t>
+            </w:r>
+          </w:p>
+        </w:tc>
+        <w:tc>
+          <w:tcPr>
+            <w:tcW w:w="8861" w:type="dxa"/>
+            <w:tcBorders/>
+            <w:vAlign w:val="center"/>
+          </w:tcPr>
+          <w:p>
+            <w:pPr>
+              <w:pStyle w:val="TableContents"/>
+              <w:widowControl w:val="false"/>
+              <w:suppressLineNumbers/>
+              <w:bidi w:val="0"/>
+              <w:jc w:val="left"/>
+              <w:rPr/>
+            </w:pPr>
+            <w:r>
+              <w:rPr/>
+              <w:t>Sent when someone uses “Forgot password?”.</w:t>
+            </w:r>
+          </w:p>
+        </w:tc>
+      </w:tr>
+      <w:tr>
+        <w:trPr/>
+        <w:tc>
+          <w:tcPr>
+            <w:tcW w:w="1005" w:type="dxa"/>
+            <w:tcBorders/>
+            <w:vAlign w:val="center"/>
+          </w:tcPr>
+          <w:p>
+            <w:pPr>
+              <w:pStyle w:val="TableContents"/>
+              <w:bidi w:val="0"/>
+              <w:jc w:val="left"/>
+              <w:rPr>
+                <w:b/>
+              </w:rPr>
+            </w:pPr>
+            <w:r>
+              <w:rPr>
+                <w:b/>
+              </w:rPr>
+              <w:t>Goes to</w:t>
+            </w:r>
+          </w:p>
+        </w:tc>
+        <w:tc>
+          <w:tcPr>
+            <w:tcW w:w="8861" w:type="dxa"/>
+            <w:tcBorders/>
+            <w:vAlign w:val="center"/>
+          </w:tcPr>
+          <w:p>
+            <w:pPr>
+              <w:pStyle w:val="TableContents"/>
+              <w:widowControl w:val="false"/>
+              <w:suppressLineNumbers/>
+              <w:bidi w:val="0"/>
+              <w:jc w:val="left"/>
+              <w:rPr/>
+            </w:pPr>
+            <w:r>
+              <w:rPr/>
+              <w:t>Anyone asking to reset</w:t>
+            </w:r>
+          </w:p>
+        </w:tc>
+      </w:tr>
+      <w:tr>
+        <w:trPr/>
+        <w:tc>
+          <w:tcPr>
+            <w:tcW w:w="1005" w:type="dxa"/>
+            <w:tcBorders/>
+            <w:vAlign w:val="center"/>
+          </w:tcPr>
+          <w:p>
+            <w:pPr>
+              <w:pStyle w:val="TableContents"/>
+              <w:bidi w:val="0"/>
+              <w:jc w:val="left"/>
+              <w:rPr>
+                <w:b/>
+              </w:rPr>
+            </w:pPr>
+            <w:r>
+              <w:rPr>
+                <w:b/>
+              </w:rPr>
+              <w:t>Status</w:t>
+            </w:r>
+          </w:p>
+        </w:tc>
+        <w:tc>
+          <w:tcPr>
+            <w:tcW w:w="8861" w:type="dxa"/>
+            <w:tcBorders/>
+            <w:vAlign w:val="center"/>
+          </w:tcPr>
+          <w:p>
+            <w:pPr>
+              <w:pStyle w:val="TableContents"/>
+              <w:widowControl w:val="false"/>
+              <w:suppressLineNumbers/>
+              <w:bidi w:val="0"/>
+              <w:jc w:val="left"/>
+              <w:rPr/>
+            </w:pPr>
+            <w:r>
+              <w:rPr/>
+              <w:t>Redesigned to match the others — it was a bare text link. The new version also fixes two things that made resets fail outright: the link now works on any device, and it leads to a screen that actually sets a new password rather than signing the person in and leaving the old one in place.</w:t>
+            </w:r>
+          </w:p>
+        </w:tc>
+      </w:tr>
+      <w:tr>
+        <w:trPr/>
+        <w:tc>
+          <w:tcPr>
+            <w:tcW w:w="1005" w:type="dxa"/>
+            <w:tcBorders/>
+            <w:vAlign w:val="center"/>
+          </w:tcPr>
+          <w:p>
+            <w:pPr>
+              <w:pStyle w:val="TableContents"/>
+              <w:bidi w:val="0"/>
+              <w:jc w:val="left"/>
+              <w:rPr>
+                <w:b/>
+              </w:rPr>
+            </w:pPr>
+            <w:r>
+              <w:rPr>
+                <w:b/>
+              </w:rPr>
+              <w:t>In the code</w:t>
+            </w:r>
+          </w:p>
+        </w:tc>
+        <w:tc>
+          <w:tcPr>
+            <w:tcW w:w="8861" w:type="dxa"/>
+            <w:tcBorders/>
+            <w:vAlign w:val="center"/>
+          </w:tcPr>
+          <w:p>
+            <w:pPr>
+              <w:pStyle w:val="TableContents"/>
+              <w:bidi w:val="0"/>
+              <w:ind w:hanging="0" w:left="0" w:right="0"/>
+              <w:jc w:val="left"/>
+              <w:rPr>
+                <w:rFonts w:ascii="Consolas;monospace" w:hAnsi="Consolas;monospace"/>
+              </w:rPr>
+            </w:pPr>
+            <w:r>
+              <w:rPr>
+                <w:rFonts w:ascii="Consolas;monospace" w:hAnsi="Consolas;monospace"/>
+              </w:rPr>
+              <w:t>docs/supabase-email-templates/reset-password.html</w:t>
+            </w:r>
+          </w:p>
+        </w:tc>
+      </w:tr>
+    </w:tbl>
+    <w:p>
+      <w:pPr>
+        <w:pStyle w:val="Heading4"/>
+        <w:bidi w:val="0"/>
+        <w:jc w:val="left"/>
+        <w:rPr/>
+      </w:pPr>
+      <w:r>
+        <w:rPr/>
+        <w:t>English  —  Reset your password</w:t>
+      </w:r>
+    </w:p>
+    <w:p>
+      <w:pPr>
+        <w:pStyle w:val="BodyText"/>
+        <w:keepLines/>
+        <w:bidi w:val="0"/>
+        <w:ind w:hanging="0" w:left="0" w:right="0"/>
+        <w:jc w:val="left"/>
+        <w:rPr/>
+      </w:pPr>
+      <w:r>
+        <w:rPr/>
+        <w:drawing>
+          <wp:inline distT="0" distB="0" distL="0" distR="0">
+            <wp:extent cx="4095750" cy="3695700"/>
+            <wp:effectExtent l="0" t="0" r="0" b="0"/>
+            <wp:docPr id="20" name="Image20" descr=""/>
+            <wp:cNvGraphicFramePr>
+              <a:graphicFrameLocks xmlns:a="http://schemas.openxmlformats.org/drawingml/2006/main" noChangeAspect="1"/>
+            </wp:cNvGraphicFramePr>
+            <a:graphic xmlns:a="http://schemas.openxmlformats.org/drawingml/2006/main">
+              <a:graphicData uri="http://schemas.openxmlformats.org/drawingml/2006/picture">
+                <pic:pic xmlns:pic="http://schemas.openxmlformats.org/drawingml/2006/picture">
+                  <pic:nvPicPr>
+                    <pic:cNvPr id="20" name="Image20" descr=""/>
+                    <pic:cNvPicPr>
+                      <a:picLocks noChangeAspect="1" noChangeArrowheads="1"/>
+                    </pic:cNvPicPr>
+                  </pic:nvPicPr>
+                  <pic:blipFill>
+                    <a:blip r:embed="rId21"/>
+                    <a:stretch>
+                      <a:fillRect/>
+                    </a:stretch>
+                  </pic:blipFill>
+                  <pic:spPr bwMode="auto">
+                    <a:xfrm>
+                      <a:off x="0" y="0"/>
+                      <a:ext cx="4095750" cy="3695700"/>
+                    </a:xfrm>
+                    <a:prstGeom prst="rect">
+                      <a:avLst/>
+                    </a:prstGeom>
+                  </pic:spPr>
+                </pic:pic>
+              </a:graphicData>
+            </a:graphic>
+          </wp:inline>
+        </w:drawing>
+      </w:r>
+      <w:r>
+        <w:br w:type="page"/>
+      </w:r>
+    </w:p>
+    <w:p>
+      <w:pPr>
+        <w:pStyle w:val="Heading2"/>
+        <w:bidi w:val="0"/>
+        <w:ind w:hanging="0" w:left="0" w:right="0"/>
+        <w:jc w:val="left"/>
+        <w:rPr/>
+      </w:pPr>
+      <w:r>
+        <w:rPr/>
         <w:t>Not ours to show</w:t>
       </w:r>
     </w:p>
@@ -3251,7 +3591,7 @@
       </w:pPr>
       <w:r>
         <w:rPr/>
-        <w:t>These are real and they send today, but the wording lives outside our codebase.  ·  5 emails</w:t>
+        <w:t>These are real and they send today, but the wording lives outside our codebase.  ·  4 emails</w:t>
       </w:r>
     </w:p>
     <w:p>
@@ -3606,226 +3946,6 @@
                 <w:b/>
               </w:rPr>
               <w:t>Supabase → Authentication → Email Templates → Confirm signup</w:t>
-            </w:r>
-          </w:p>
-        </w:tc>
-      </w:tr>
-    </w:tbl>
-    <w:p>
-      <w:pPr>
-        <w:pStyle w:val="Heading3"/>
-        <w:bidi w:val="0"/>
-        <w:jc w:val="left"/>
-        <w:rPr/>
-      </w:pPr>
-      <w:r>
-        <w:rPr/>
-        <w:t>Reset your password</w:t>
-      </w:r>
-    </w:p>
-    <w:tbl>
-      <w:tblPr>
-        <w:tblW w:w="5000" w:type="pct"/>
-        <w:jc w:val="left"/>
-        <w:tblInd w:w="0" w:type="dxa"/>
-        <w:tblLayout w:type="fixed"/>
-        <w:tblCellMar>
-          <w:top w:w="28" w:type="dxa"/>
-          <w:left w:w="28" w:type="dxa"/>
-          <w:bottom w:w="28" w:type="dxa"/>
-          <w:right w:w="28" w:type="dxa"/>
-        </w:tblCellMar>
-      </w:tblPr>
-      <w:tblGrid>
-        <w:gridCol w:w="1548"/>
-        <w:gridCol w:w="8318"/>
-      </w:tblGrid>
-      <w:tr>
-        <w:trPr/>
-        <w:tc>
-          <w:tcPr>
-            <w:tcW w:w="1548" w:type="dxa"/>
-            <w:tcBorders/>
-            <w:vAlign w:val="center"/>
-          </w:tcPr>
-          <w:p>
-            <w:pPr>
-              <w:pStyle w:val="TableContents"/>
-              <w:bidi w:val="0"/>
-              <w:jc w:val="left"/>
-              <w:rPr>
-                <w:b/>
-              </w:rPr>
-            </w:pPr>
-            <w:r>
-              <w:rPr>
-                <w:b/>
-              </w:rPr>
-              <w:t>When</w:t>
-            </w:r>
-          </w:p>
-        </w:tc>
-        <w:tc>
-          <w:tcPr>
-            <w:tcW w:w="8318" w:type="dxa"/>
-            <w:tcBorders/>
-            <w:vAlign w:val="center"/>
-          </w:tcPr>
-          <w:p>
-            <w:pPr>
-              <w:pStyle w:val="TableContents"/>
-              <w:widowControl w:val="false"/>
-              <w:suppressLineNumbers/>
-              <w:bidi w:val="0"/>
-              <w:jc w:val="left"/>
-              <w:rPr/>
-            </w:pPr>
-            <w:r>
-              <w:rPr/>
-              <w:t>Sent from the forgot-password page, and from Settings.</w:t>
-            </w:r>
-          </w:p>
-        </w:tc>
-      </w:tr>
-      <w:tr>
-        <w:trPr/>
-        <w:tc>
-          <w:tcPr>
-            <w:tcW w:w="1548" w:type="dxa"/>
-            <w:tcBorders/>
-            <w:vAlign w:val="center"/>
-          </w:tcPr>
-          <w:p>
-            <w:pPr>
-              <w:pStyle w:val="TableContents"/>
-              <w:bidi w:val="0"/>
-              <w:jc w:val="left"/>
-              <w:rPr>
-                <w:b/>
-              </w:rPr>
-            </w:pPr>
-            <w:r>
-              <w:rPr>
-                <w:b/>
-              </w:rPr>
-              <w:t>Goes to</w:t>
-            </w:r>
-          </w:p>
-        </w:tc>
-        <w:tc>
-          <w:tcPr>
-            <w:tcW w:w="8318" w:type="dxa"/>
-            <w:tcBorders/>
-            <w:vAlign w:val="center"/>
-          </w:tcPr>
-          <w:p>
-            <w:pPr>
-              <w:pStyle w:val="TableContents"/>
-              <w:widowControl w:val="false"/>
-              <w:suppressLineNumbers/>
-              <w:bidi w:val="0"/>
-              <w:jc w:val="left"/>
-              <w:rPr/>
-            </w:pPr>
-            <w:r>
-              <w:rPr/>
-              <w:t>Anyone who asks for a reset</w:t>
-            </w:r>
-          </w:p>
-        </w:tc>
-      </w:tr>
-      <w:tr>
-        <w:trPr/>
-        <w:tc>
-          <w:tcPr>
-            <w:tcW w:w="1548" w:type="dxa"/>
-            <w:tcBorders/>
-            <w:vAlign w:val="center"/>
-          </w:tcPr>
-          <w:p>
-            <w:pPr>
-              <w:pStyle w:val="TableContents"/>
-              <w:bidi w:val="0"/>
-              <w:jc w:val="left"/>
-              <w:rPr>
-                <w:b/>
-              </w:rPr>
-            </w:pPr>
-            <w:r>
-              <w:rPr>
-                <w:b/>
-              </w:rPr>
-              <w:t>Review it at</w:t>
-            </w:r>
-          </w:p>
-        </w:tc>
-        <w:tc>
-          <w:tcPr>
-            <w:tcW w:w="8318" w:type="dxa"/>
-            <w:tcBorders/>
-            <w:vAlign w:val="center"/>
-          </w:tcPr>
-          <w:p>
-            <w:pPr>
-              <w:pStyle w:val="TableContents"/>
-              <w:bidi w:val="0"/>
-              <w:jc w:val="left"/>
-              <w:rPr>
-                <w:b/>
-              </w:rPr>
-            </w:pPr>
-            <w:r>
-              <w:rPr>
-                <w:b/>
-              </w:rPr>
-              <w:t>Supabase → Authentication → Email Templates → Reset password</w:t>
-            </w:r>
-          </w:p>
-        </w:tc>
-      </w:tr>
-      <w:tr>
-        <w:trPr/>
-        <w:tc>
-          <w:tcPr>
-            <w:tcW w:w="1548" w:type="dxa"/>
-            <w:tcBorders/>
-            <w:vAlign w:val="center"/>
-          </w:tcPr>
-          <w:p>
-            <w:pPr>
-              <w:pStyle w:val="TableContents"/>
-              <w:bidi w:val="0"/>
-              <w:jc w:val="left"/>
-              <w:rPr>
-                <w:b/>
-              </w:rPr>
-            </w:pPr>
-            <w:r>
-              <w:rPr>
-                <w:b/>
-              </w:rPr>
-              <w:t>Note</w:t>
-            </w:r>
-          </w:p>
-        </w:tc>
-        <w:tc>
-          <w:tcPr>
-            <w:tcW w:w="8318" w:type="dxa"/>
-            <w:tcBorders/>
-            <w:vAlign w:val="center"/>
-          </w:tcPr>
-          <w:p>
-            <w:pPr>
-              <w:pStyle w:val="TableContents"/>
-              <w:widowControl w:val="false"/>
-              <w:suppressLineNumbers/>
-              <w:bidi w:val="0"/>
-              <w:jc w:val="left"/>
-              <w:rPr/>
-            </w:pPr>
-            <w:r>
-              <w:rPr/>
-              <w:t>The two places that send this point the recipient at different pages afterwards. Worth making consistent.</w:t>
             </w:r>
           </w:p>
         </w:tc>

</xml_diff>